<commit_message>
fix(lenh-xuat): bỏ tô vàng trong bản in .docx + đổi icon máy in -> FileDown (Word)
- Template lenh-xuat.docx: xóa 22 highlight vàng (chỉ là dấu fill-in) -> bản xuất sạch
- Nút xuất: icon Printer -> FileDown (xanh), tooltip "Xuất Word (.docx)"; footer modal "Xuất Word"

Co-Authored-By: Claude Opus 4.8 <noreply@anthropic.com>
</commit_message>
<xml_diff>
--- a/src/lib/report/lenh-xuat.docx
+++ b/src/lib/report/lenh-xuat.docx
@@ -76,27 +76,21 @@
         <w:t xml:space="preserve">Ngày </w:t>
       </w:r>
       <w:r>
-        <w:rPr>
-          <w:highlight w:val="yellow"/>
-        </w:rPr>
+        <w:rPr/>
         <w:t>{{ngay_dd}}</w:t>
       </w:r>
       <w:r>
         <w:t xml:space="preserve"> tháng </w:t>
       </w:r>
       <w:r>
-        <w:rPr>
-          <w:highlight w:val="yellow"/>
-        </w:rPr>
+        <w:rPr/>
         <w:t>{{ngay_mm}}</w:t>
       </w:r>
       <w:r>
         <w:t xml:space="preserve"> năm </w:t>
       </w:r>
       <w:r>
-        <w:rPr>
-          <w:highlight w:val="yellow"/>
-        </w:rPr>
+        <w:rPr/>
         <w:t>{{ngay_yyyy}}</w:t>
       </w:r>
     </w:p>
@@ -179,9 +173,7 @@
           </w:tcPr>
           <w:p>
             <w:r>
-              <w:rPr>
-                <w:highlight w:val="yellow"/>
-              </w:rPr>
+              <w:rPr/>
               <w:t>{{so_lenh}}</w:t>
             </w:r>
           </w:p>
@@ -226,7 +218,6 @@
             <w:r>
               <w:rPr>
                 <w:b/>
-                <w:highlight w:val="yellow"/>
               </w:rPr>
               <w:t>{{ten_khach}}</w:t>
             </w:r>
@@ -265,9 +256,7 @@
           </w:tcPr>
           <w:p>
             <w:r>
-              <w:rPr>
-                <w:highlight w:val="yellow"/>
-              </w:rPr>
+              <w:rPr/>
               <w:t>{{dia_chi}}</w:t>
             </w:r>
           </w:p>
@@ -305,9 +294,7 @@
           </w:tcPr>
           <w:p>
             <w:r>
-              <w:rPr>
-                <w:highlight w:val="yellow"/>
-              </w:rPr>
+              <w:rPr/>
               <w:t>{{mst}}</w:t>
             </w:r>
           </w:p>
@@ -340,9 +327,7 @@
           </w:tcPr>
           <w:p>
             <w:r>
-              <w:rPr>
-                <w:highlight w:val="yellow"/>
-              </w:rPr>
+              <w:rPr/>
               <w:t>Kinh doanh</w:t>
             </w:r>
           </w:p>
@@ -408,9 +393,7 @@
           </w:tcPr>
           <w:p>
             <w:r>
-              <w:rPr>
-                <w:highlight w:val="yellow"/>
-              </w:rPr>
+              <w:rPr/>
               <w:t>{{nv_kinh_doanh}}</w:t>
             </w:r>
           </w:p>
@@ -707,7 +690,6 @@
             <w:r>
               <w:rPr>
                 <w:szCs w:val="24"/>
-                <w:highlight w:val="yellow"/>
               </w:rPr>
               <w:t>{{ten_hang}}</w:t>
             </w:r>
@@ -729,13 +711,11 @@
               <w:jc w:val="center"/>
               <w:rPr>
                 <w:szCs w:val="24"/>
-                <w:highlight w:val="yellow"/>
-              </w:rPr>
-            </w:pPr>
-            <w:r>
-              <w:rPr>
-                <w:szCs w:val="24"/>
-                <w:highlight w:val="yellow"/>
+              </w:rPr>
+            </w:pPr>
+            <w:r>
+              <w:rPr>
+                <w:szCs w:val="24"/>
               </w:rPr>
               <w:t>{{dvt}}</w:t>
             </w:r>
@@ -758,13 +738,11 @@
               <w:jc w:val="center"/>
               <w:rPr>
                 <w:szCs w:val="24"/>
-                <w:highlight w:val="yellow"/>
-              </w:rPr>
-            </w:pPr>
-            <w:r>
-              <w:rPr>
-                <w:szCs w:val="24"/>
-                <w:highlight w:val="yellow"/>
+              </w:rPr>
+            </w:pPr>
+            <w:r>
+              <w:rPr>
+                <w:szCs w:val="24"/>
               </w:rPr>
               <w:t>{{so_luong}}</w:t>
             </w:r>
@@ -787,13 +765,11 @@
               <w:jc w:val="right"/>
               <w:rPr>
                 <w:szCs w:val="24"/>
-                <w:highlight w:val="yellow"/>
-              </w:rPr>
-            </w:pPr>
-            <w:r>
-              <w:rPr>
-                <w:szCs w:val="24"/>
-                <w:highlight w:val="yellow"/>
+              </w:rPr>
+            </w:pPr>
+            <w:r>
+              <w:rPr>
+                <w:szCs w:val="24"/>
               </w:rPr>
               <w:t>{{don_gia}}</w:t>
             </w:r>
@@ -820,7 +796,6 @@
             <w:r>
               <w:rPr>
                 <w:szCs w:val="24"/>
-                <w:highlight w:val="yellow"/>
               </w:rPr>
               <w:t>{{thanh_tien}}{{/lines}}</w:t>
             </w:r>
@@ -882,7 +857,6 @@
               <w:rPr>
                 <w:b/>
                 <w:szCs w:val="24"/>
-                <w:highlight w:val="yellow"/>
               </w:rPr>
               <w:t>{{tien_hang}}</w:t>
             </w:r>
@@ -944,7 +918,6 @@
               <w:rPr>
                 <w:b/>
                 <w:szCs w:val="24"/>
-                <w:highlight w:val="yellow"/>
               </w:rPr>
               <w:t>{{tien_thue}}</w:t>
             </w:r>
@@ -1006,7 +979,6 @@
               <w:rPr>
                 <w:b/>
                 <w:szCs w:val="24"/>
-                <w:highlight w:val="yellow"/>
               </w:rPr>
               <w:t>{{tong}}</w:t>
             </w:r>
@@ -1032,7 +1004,6 @@
         <w:rPr>
           <w:i/>
           <w:szCs w:val="24"/>
-          <w:highlight w:val="yellow"/>
         </w:rPr>
         <w:t>{{bang_chu}}</w:t>
       </w:r>
@@ -1081,7 +1052,6 @@
       <w:r>
         <w:rPr>
           <w:szCs w:val="24"/>
-          <w:highlight w:val="yellow"/>
         </w:rPr>
         <w:t>{{so_hop_dong}}</w:t>
       </w:r>

</xml_diff>